<commit_message>
Add screenshot to assignment
</commit_message>
<xml_diff>
--- a/module-1/Dorscher_Assignment1_2.docx
+++ b/module-1/Dorscher_Assignment1_2.docx
@@ -35,11 +35,12 @@
         <w:t>New directory</w:t>
       </w:r>
     </w:p>
+    <w:p/>
     <w:p>
       <w:r>
         <w:drawing>
-          <wp:inline distT="0" distB="0" distL="0" distR="0" wp14:anchorId="01FA6D39" wp14:editId="44A91E53">
-            <wp:extent cx="5943600" cy="3055620"/>
+          <wp:inline distT="0" distB="0" distL="0" distR="0" wp14:anchorId="01FA6D39" wp14:editId="724288BB">
+            <wp:extent cx="5943600" cy="1123950"/>
             <wp:effectExtent l="0" t="0" r="0" b="0"/>
             <wp:docPr id="119542487" name="Picture 1"/>
             <wp:cNvGraphicFramePr>
@@ -52,8 +53,174 @@
                     <pic:cNvPr id="119542487" name=""/>
                     <pic:cNvPicPr/>
                   </pic:nvPicPr>
+                  <pic:blipFill rotWithShape="1">
+                    <a:blip r:embed="rId4"/>
+                    <a:srcRect b="63217"/>
+                    <a:stretch>
+                      <a:fillRect/>
+                    </a:stretch>
+                  </pic:blipFill>
+                  <pic:spPr bwMode="auto">
+                    <a:xfrm>
+                      <a:off x="0" y="0"/>
+                      <a:ext cx="5943600" cy="1123950"/>
+                    </a:xfrm>
+                    <a:prstGeom prst="rect">
+                      <a:avLst/>
+                    </a:prstGeom>
+                    <a:ln>
+                      <a:noFill/>
+                    </a:ln>
+                    <a:extLst>
+                      <a:ext uri="{53640926-AAD7-44D8-BBD7-CCE9431645EC}">
+                        <a14:shadowObscured xmlns:a14="http://schemas.microsoft.com/office/drawing/2010/main"/>
+                      </a:ext>
+                    </a:extLst>
+                  </pic:spPr>
+                </pic:pic>
+              </a:graphicData>
+            </a:graphic>
+          </wp:inline>
+        </w:drawing>
+      </w:r>
+    </w:p>
+    <w:p>
+      <w:r>
+        <w:t>New file</w:t>
+      </w:r>
+    </w:p>
+    <w:p/>
+    <w:p>
+      <w:r>
+        <w:drawing>
+          <wp:inline distT="0" distB="0" distL="0" distR="0" wp14:anchorId="5258F5F0" wp14:editId="55D01416">
+            <wp:extent cx="5943600" cy="2000250"/>
+            <wp:effectExtent l="0" t="0" r="0" b="0"/>
+            <wp:docPr id="1001826984" name="Picture 1"/>
+            <wp:cNvGraphicFramePr>
+              <a:graphicFrameLocks xmlns:a="http://schemas.openxmlformats.org/drawingml/2006/main" noChangeAspect="1"/>
+            </wp:cNvGraphicFramePr>
+            <a:graphic xmlns:a="http://schemas.openxmlformats.org/drawingml/2006/main">
+              <a:graphicData uri="http://schemas.openxmlformats.org/drawingml/2006/picture">
+                <pic:pic xmlns:pic="http://schemas.openxmlformats.org/drawingml/2006/picture">
+                  <pic:nvPicPr>
+                    <pic:cNvPr id="1001826984" name=""/>
+                    <pic:cNvPicPr/>
+                  </pic:nvPicPr>
+                  <pic:blipFill rotWithShape="1">
+                    <a:blip r:embed="rId5"/>
+                    <a:srcRect b="34539"/>
+                    <a:stretch>
+                      <a:fillRect/>
+                    </a:stretch>
+                  </pic:blipFill>
+                  <pic:spPr bwMode="auto">
+                    <a:xfrm>
+                      <a:off x="0" y="0"/>
+                      <a:ext cx="5943600" cy="2000250"/>
+                    </a:xfrm>
+                    <a:prstGeom prst="rect">
+                      <a:avLst/>
+                    </a:prstGeom>
+                    <a:ln>
+                      <a:noFill/>
+                    </a:ln>
+                    <a:extLst>
+                      <a:ext uri="{53640926-AAD7-44D8-BBD7-CCE9431645EC}">
+                        <a14:shadowObscured xmlns:a14="http://schemas.microsoft.com/office/drawing/2010/main"/>
+                      </a:ext>
+                    </a:extLst>
+                  </pic:spPr>
+                </pic:pic>
+              </a:graphicData>
+            </a:graphic>
+          </wp:inline>
+        </w:drawing>
+      </w:r>
+    </w:p>
+    <w:p>
+      <w:r>
+        <w:t>Staged File</w:t>
+      </w:r>
+    </w:p>
+    <w:p>
+      <w:r>
+        <w:drawing>
+          <wp:inline distT="0" distB="0" distL="0" distR="0" wp14:anchorId="1AFDECAC" wp14:editId="6A28A6DD">
+            <wp:extent cx="5943600" cy="1239520"/>
+            <wp:effectExtent l="0" t="0" r="0" b="0"/>
+            <wp:docPr id="1110614695" name="Picture 1"/>
+            <wp:cNvGraphicFramePr>
+              <a:graphicFrameLocks xmlns:a="http://schemas.openxmlformats.org/drawingml/2006/main" noChangeAspect="1"/>
+            </wp:cNvGraphicFramePr>
+            <a:graphic xmlns:a="http://schemas.openxmlformats.org/drawingml/2006/main">
+              <a:graphicData uri="http://schemas.openxmlformats.org/drawingml/2006/picture">
+                <pic:pic xmlns:pic="http://schemas.openxmlformats.org/drawingml/2006/picture">
+                  <pic:nvPicPr>
+                    <pic:cNvPr id="1110614695" name=""/>
+                    <pic:cNvPicPr/>
+                  </pic:nvPicPr>
+                  <pic:blipFill rotWithShape="1">
+                    <a:blip r:embed="rId6"/>
+                    <a:srcRect t="59435"/>
+                    <a:stretch>
+                      <a:fillRect/>
+                    </a:stretch>
+                  </pic:blipFill>
+                  <pic:spPr bwMode="auto">
+                    <a:xfrm>
+                      <a:off x="0" y="0"/>
+                      <a:ext cx="5943600" cy="1239520"/>
+                    </a:xfrm>
+                    <a:prstGeom prst="rect">
+                      <a:avLst/>
+                    </a:prstGeom>
+                    <a:ln>
+                      <a:noFill/>
+                    </a:ln>
+                    <a:extLst>
+                      <a:ext uri="{53640926-AAD7-44D8-BBD7-CCE9431645EC}">
+                        <a14:shadowObscured xmlns:a14="http://schemas.microsoft.com/office/drawing/2010/main"/>
+                      </a:ext>
+                    </a:extLst>
+                  </pic:spPr>
+                </pic:pic>
+              </a:graphicData>
+            </a:graphic>
+          </wp:inline>
+        </w:drawing>
+      </w:r>
+    </w:p>
+    <w:p>
+      <w:r>
+        <w:br w:type="page"/>
+      </w:r>
+    </w:p>
+    <w:p>
+      <w:r>
+        <w:lastRenderedPageBreak/>
+        <w:t>Commit and upload changes to remote repository</w:t>
+      </w:r>
+    </w:p>
+    <w:p>
+      <w:r>
+        <w:drawing>
+          <wp:inline distT="0" distB="0" distL="0" distR="0" wp14:anchorId="166CDD83" wp14:editId="32315AB4">
+            <wp:extent cx="5943600" cy="3055620"/>
+            <wp:effectExtent l="0" t="0" r="0" b="0"/>
+            <wp:docPr id="1910016731" name="Picture 1"/>
+            <wp:cNvGraphicFramePr>
+              <a:graphicFrameLocks xmlns:a="http://schemas.openxmlformats.org/drawingml/2006/main" noChangeAspect="1"/>
+            </wp:cNvGraphicFramePr>
+            <a:graphic xmlns:a="http://schemas.openxmlformats.org/drawingml/2006/main">
+              <a:graphicData uri="http://schemas.openxmlformats.org/drawingml/2006/picture">
+                <pic:pic xmlns:pic="http://schemas.openxmlformats.org/drawingml/2006/picture">
+                  <pic:nvPicPr>
+                    <pic:cNvPr id="1910016731" name=""/>
+                    <pic:cNvPicPr/>
+                  </pic:nvPicPr>
                   <pic:blipFill>
-                    <a:blip r:embed="rId4"/>
+                    <a:blip r:embed="rId7"/>
                     <a:stretch>
                       <a:fillRect/>
                     </a:stretch>
@@ -76,16 +243,11 @@
     </w:p>
     <w:p>
       <w:r>
-        <w:t>New file</w:t>
-      </w:r>
-    </w:p>
-    <w:p>
-      <w:r>
         <w:drawing>
-          <wp:inline distT="0" distB="0" distL="0" distR="0" wp14:anchorId="5258F5F0" wp14:editId="03E89CA4">
-            <wp:extent cx="5943600" cy="3055620"/>
+          <wp:inline distT="0" distB="0" distL="0" distR="0" wp14:anchorId="01768A4A" wp14:editId="4B52B8B5">
+            <wp:extent cx="6690377" cy="3606800"/>
             <wp:effectExtent l="0" t="0" r="0" b="0"/>
-            <wp:docPr id="1001826984" name="Picture 1"/>
+            <wp:docPr id="495088720" name="Picture 1"/>
             <wp:cNvGraphicFramePr>
               <a:graphicFrameLocks xmlns:a="http://schemas.openxmlformats.org/drawingml/2006/main" noChangeAspect="1"/>
             </wp:cNvGraphicFramePr>
@@ -93,11 +255,11 @@
               <a:graphicData uri="http://schemas.openxmlformats.org/drawingml/2006/picture">
                 <pic:pic xmlns:pic="http://schemas.openxmlformats.org/drawingml/2006/picture">
                   <pic:nvPicPr>
-                    <pic:cNvPr id="1001826984" name=""/>
+                    <pic:cNvPr id="495088720" name=""/>
                     <pic:cNvPicPr/>
                   </pic:nvPicPr>
                   <pic:blipFill>
-                    <a:blip r:embed="rId5"/>
+                    <a:blip r:embed="rId8"/>
                     <a:stretch>
                       <a:fillRect/>
                     </a:stretch>
@@ -105,7 +267,7 @@
                   <pic:spPr>
                     <a:xfrm>
                       <a:off x="0" y="0"/>
-                      <a:ext cx="5943600" cy="3055620"/>
+                      <a:ext cx="6693022" cy="3608226"/>
                     </a:xfrm>
                     <a:prstGeom prst="rect">
                       <a:avLst/>
@@ -118,18 +280,6 @@
         </w:drawing>
       </w:r>
     </w:p>
-    <w:p>
-      <w:r>
-        <w:br w:type="page"/>
-      </w:r>
-    </w:p>
-    <w:p>
-      <w:r>
-        <w:lastRenderedPageBreak/>
-        <w:t>Staged File</w:t>
-      </w:r>
-    </w:p>
-    <w:p/>
     <w:sectPr>
       <w:pgSz w:w="12240" w:h="15840"/>
       <w:pgMar w:top="1440" w:right="1440" w:bottom="1440" w:left="1440" w:header="720" w:footer="720" w:gutter="0"/>

</xml_diff>